<commit_message>
feat(plantillas): placeholders para pérdida de caja, lugar de firma y nacionalidad en SARGO
- {ASIGNACION_CAJA_TEXTO}: reemplaza los "$ 3.000 Tres Mil" / "$XXXXX
  (en palabras)" fijos en las 13 plantillas; nuevo campo "pérdida de
  caja" en portal y form interno (remuneracion.perdida_caja; 0 → "No
  se pacta").
- {CIUDAD_FIRMA}: reemplaza "En (la ciudad de) Curauma"; col nueva
  clientes.lugar_firma_contrato (Sargo = Curauma), fallback ciudad/comuna.
- Se elimina "chileno" fijo de la comparecencia (también en versiones
  extranjero); la nacionalidad ya va en {NACIONALIDAD_EMPLEADO}.
- Script idempotente de parcheo cross-run en scripts/.

Co-Authored-By: Claude Fable 5 <noreply@anthropic.com>
</commit_message>
<xml_diff>
--- a/app/plantillas/SARGO 78179175-K/ANEXO Cambio Jornada FT a PT (genericizar).docx
+++ b/app/plantillas/SARGO 78179175-K/ANEXO Cambio Jornada FT a PT (genericizar).docx
@@ -71,7 +71,7 @@
         <w:rPr>
           <w:lang w:val="es-ES"/>
         </w:rPr>
-        <w:t>En Curauma, a _______________________ , entre </w:t>
+        <w:t>En {CIUDAD_FIRMA}, a _______________________ , entre </w:t>
       </w:r>
       <w:r>
         <w:rPr>
@@ -642,7 +642,7 @@
           <w:lang w:val="es-ES"/>
         </w:rPr>
         <w:br/>
-        <w:t>3) Asignación de Perdida de Caja: $ 3.000 Tres Mil.</w:t>
+        <w:t>3) Asignación de Pérdida de Caja: {ASIGNACION_CAJA_TEXTO}.</w:t>
       </w:r>
       <w:r>
         <w:rPr>

</xml_diff>

<commit_message>
fix(plantillas): ASTOP FT Extranjero reconstruido sobre la redacción moderna de tienda
La versión anterior era la redacción antigua corta (30 párrafos), sin
las cláusulas modernas de tienda (protocolo de servicio, obligaciones
por turno, estándares de imagen aStop). Ahora = ASTOP FT moderno + el
bloque VIGÉSIMO NOVENO de cláusulas de extranjero (vigencia hasta visa,
régimen previsional/Ley 18.156, impuesto a la renta >13,5 UTM), copiado
con formato desde el borrador ASTOP PT Extranjero. La antigua queda en
plantillas-desactivadas/. Script reutilizable para construir las
versiones extranjero que faltan.

Co-Authored-By: Claude Fable 5 <noreply@anthropic.com>
</commit_message>
<xml_diff>
--- a/app/plantillas/SARGO 78179175-K/ANEXO Cambio Jornada FT a PT (genericizar).docx
+++ b/app/plantillas/SARGO 78179175-K/ANEXO Cambio Jornada FT a PT (genericizar).docx
@@ -662,6 +662,12 @@
           <w:lang w:val="es-ES"/>
         </w:rPr>
         <w:br/>
+      </w:r>
+      <w:r>
+        <w:rPr>
+          <w:lang w:val="es-ES"/>
+        </w:rPr>
+        <w:lastRenderedPageBreak/>
         <w:t>5) Asignación de Colación: ${ASIGNACION_COLACION}, ({ASIGNACION_COLACION_PALABRA}). </w:t>
       </w:r>
     </w:p>
@@ -670,8 +676,7 @@
         <w:rPr>
           <w:lang w:val="en-US"/>
         </w:rPr>
-        <w:lastRenderedPageBreak/>
-        <w:t> </w:t>
+        <w:t xml:space="preserve">La remuneración y la asignación a que tenga derecho la trabajadora serán pagadas por el empleador el QUINTO día hábil del mes siguiente, previa deducción de los montos que las leyes vigentes al momento del pago establezcan El pago de la remuneración se efecturará a través de la transferencia Bancaria electronica que la trabajadora designe para tal efecto. </w:t>
       </w:r>
     </w:p>
     <w:p>
@@ -679,33 +684,7 @@
         <w:rPr>
           <w:lang w:val="en-US"/>
         </w:rPr>
-        <w:t xml:space="preserve">La remuneración y la asignación a que tenga derecho la trabajadora serán pagadas por el empleador el QUINTO día hábil del mes siguiente, previa deducción de los montos que las leyes vigentes al momento del pago establezcan El pago de la remuneración se efecturará a través de la transferencia Bancaria electronica que la trabajadora designe para tal efecto. </w:t>
-      </w:r>
-    </w:p>
-    <w:p>
-      <w:r>
-        <w:rPr>
-          <w:lang w:val="en-US"/>
-        </w:rPr>
-        <w:t> </w:t>
-      </w:r>
-    </w:p>
-    <w:p>
-      <w:r>
-        <w:rPr>
-          <w:lang w:val="en-US"/>
-        </w:rPr>
         <w:t>Las deducciones que “El Empleador” podrá según los casos -practicas a las remuneraciones, son todas aquellas que dispone el artículo 58 del Código del Trabajo”.”.</w:t>
-      </w:r>
-    </w:p>
-    <w:p>
-      <w:r>
-        <w:rPr>
-          <w:b/>
-          <w:bCs/>
-          <w:lang w:val="en-US"/>
-        </w:rPr>
-        <w:t> </w:t>
       </w:r>
     </w:p>
     <w:p>

</xml_diff>